<commit_message>
Update flow business integrate to test script
</commit_message>
<xml_diff>
--- a/collections/base_template.docx
+++ b/collections/base_template.docx
@@ -80,30 +80,10 @@
       </w:pPr>
       <w:r>
         <w:rPr>
-          <w:b w:val="1"/>
-          <w:bCs w:val="1"/>
+          <w:b/>
           <w:sz w:val="42"/>
-          <w:szCs w:val="42"/>
-          <w:highlight w:val="white"/>
-          <w:rtl w:val="0"/>
-        </w:rPr>
-        <w:t xml:space="preserve">2026.DBBI.AP.I.012 </w:t>
-      </w:r>
-      <w:r>
-        <w:rPr>
-          <w:b w:val="1"/>
-          <w:bCs w:val="1"/>
-          <w:sz w:val="44"/>
-          <w:szCs w:val="44"/>
-          <w:highlight w:val="white"/>
-          <w:rtl w:val="0"/>
-        </w:rPr>
-        <w:t xml:space="preserve">- PENGEMBANGAN JANGKA WAKTU KREDIT DIATAS 5 TAHUN KMG BANK JATIM GEN 2 </w:t>
-      </w:r>
-      <w:r>
-        <w:rPr>
-          <w:rtl w:val="0"/>
-        </w:rPr>
+        </w:rPr>
+        <w:t>{{PROJECT_CODE}} - {{REPORT_TITLE}}</w:t>
       </w:r>
     </w:p>
     <w:p>
@@ -126,14 +106,11 @@
       </w:pPr>
       <w:r>
         <w:rPr>
-          <w:rFonts w:ascii="Times New Roman" w:cs="Times New Roman" w:eastAsia="Times New Roman" w:hAnsi="Times New Roman"/>
-          <w:b w:val="1"/>
-          <w:bCs w:val="1"/>
+          <w:rFonts w:ascii="Times New Roman" w:hAnsi="Times New Roman"/>
+          <w:b/>
           <w:sz w:val="44"/>
-          <w:szCs w:val="44"/>
-          <w:rtl w:val="0"/>
-        </w:rPr>
-        <w:t xml:space="preserve">20/07/2026</w:t>
+        </w:rPr>
+        <w:t>{{REPORT_DATE}}</w:t>
       </w:r>
     </w:p>
     <w:p>

</xml_diff>

<commit_message>
add new test case multi fasilitas
</commit_message>
<xml_diff>
--- a/collections/base_template.docx
+++ b/collections/base_template.docx
@@ -79,11 +79,9 @@
         </w:rPr>
       </w:pPr>
       <w:r>
-        <w:rPr>
-          <w:b/>
-          <w:sz w:val="42"/>
-        </w:rPr>
-        <w:t>{{PROJECT_CODE}} - {{REPORT_TITLE}}</w:t>
+        <w:t>{{REPORT_TITLE}}</w:t>
+        <w:br/>
+        <w:t>{{PROJECT_CODE}}</w:t>
       </w:r>
     </w:p>
     <w:p>

</xml_diff>